<commit_message>
docs: add rendered class diagram image to Phase-1 proposal
Co-authored-by: Cursor <cursoragent@cursor.com>
</commit_message>
<xml_diff>
--- a/docs/NoteKeeper_Phase1_Project_Proposal.docx
+++ b/docs/NoteKeeper_Phase1_Project_Proposal.docx
@@ -2636,16 +2636,53 @@
       </w:r>
     </w:p>
     <w:p>
+      <w:r>
+        <w:drawing>
+          <wp:inline xmlns:a="http://schemas.openxmlformats.org/drawingml/2006/main" xmlns:pic="http://schemas.openxmlformats.org/drawingml/2006/picture">
+            <wp:extent cx="5943600" cy="4020671"/>
+            <wp:docPr id="1" name="Picture 1"/>
+            <wp:cNvGraphicFramePr>
+              <a:graphicFrameLocks noChangeAspect="1"/>
+            </wp:cNvGraphicFramePr>
+            <a:graphic>
+              <a:graphicData uri="http://schemas.openxmlformats.org/drawingml/2006/picture">
+                <pic:pic>
+                  <pic:nvPicPr>
+                    <pic:cNvPr id="0" name="NoteKeeper_Class_Diagram.png"/>
+                    <pic:cNvPicPr/>
+                  </pic:nvPicPr>
+                  <pic:blipFill>
+                    <a:blip r:embed="rId9"/>
+                    <a:stretch>
+                      <a:fillRect/>
+                    </a:stretch>
+                  </pic:blipFill>
+                  <pic:spPr>
+                    <a:xfrm>
+                      <a:off x="0" y="0"/>
+                      <a:ext cx="5943600" cy="4020671"/>
+                    </a:xfrm>
+                    <a:prstGeom prst="rect"/>
+                  </pic:spPr>
+                </pic:pic>
+              </a:graphicData>
+            </a:graphic>
+          </wp:inline>
+        </w:drawing>
+      </w:r>
+    </w:p>
+    <w:p>
       <w:pPr>
-        <w:spacing w:after="120" w:line="276" w:lineRule="auto"/>
+        <w:jc w:val="center"/>
       </w:pPr>
       <w:r>
         <w:rPr>
           <w:rFonts w:ascii="Calibri" w:hAnsi="Calibri" w:eastAsia="Calibri"/>
           <w:b w:val="0"/>
-          <w:sz w:val="22"/>
+          <w:color w:val="6B7280"/>
+          <w:sz w:val="20"/>
         </w:rPr>
-        <w:t>Main entities in the full design:</w:t>
+        <w:t>Figure 1. Initial class diagram for NoteKeeper. Phase-1 entities (Tag, Workspace) are highlighted.</w:t>
       </w:r>
     </w:p>
     <w:p>
@@ -2658,7 +2695,7 @@
           <w:b w:val="0"/>
           <w:sz w:val="22"/>
         </w:rPr>
-        <w:t>User, UserProfile, Location, Workspace, WorkspaceMember, Page, Tag, PageTag, PageShare, Attachment, Notification, TwoFactorCode, PasswordResetToken</w:t>
+        <w:t>Main entities: User, UserProfile, Location, Workspace, WorkspaceMember, Page, Tag, PageTag, PageShare, Attachment, Notification, TwoFactorCode, PasswordResetToken.</w:t>
       </w:r>
     </w:p>
     <w:p>
@@ -3503,7 +3540,7 @@
                 <w:b w:val="0"/>
                 <w:sz w:val="20"/>
               </w:rPr>
-              <w:t>&lt;style&gt; in tags.xhtml and workspaces.xhtml</w:t>
+              <w:t>style blocks in tags.xhtml and workspaces.xhtml</w:t>
             </w:r>
           </w:p>
         </w:tc>
@@ -3568,7 +3605,7 @@
           <w:b w:val="0"/>
           <w:sz w:val="22"/>
         </w:rPr>
-        <w:t>Only one default workspace is shown. A workspace named Personal is preferred. The badge uses h:panelGroup with rendered="#{item.isDefault}".</w:t>
+        <w:t>Only one default workspace is shown. A workspace named Personal is preferred.</w:t>
       </w:r>
     </w:p>
     <w:p>

</xml_diff>